<commit_message>
acertando a linha de assinatura
</commit_message>
<xml_diff>
--- a/pdf/cadastro_emissao_gta.docx
+++ b/pdf/cadastro_emissao_gta.docx
@@ -2,29 +2,6 @@
 <file path=word/document.xml><?xml version="1.0" encoding="utf-8"?>
 <w:document xmlns:wpc="http://schemas.microsoft.com/office/word/2010/wordprocessingCanvas" xmlns:mo="http://schemas.microsoft.com/office/mac/office/2008/main" xmlns:mc="http://schemas.openxmlformats.org/markup-compatibility/2006" xmlns:mv="urn:schemas-microsoft-com:mac:vml" xmlns:o="urn:schemas-microsoft-com:office:office" xmlns:r="http://schemas.openxmlformats.org/officeDocument/2006/relationships" xmlns:m="http://schemas.openxmlformats.org/officeDocument/2006/math" xmlns:v="urn:schemas-microsoft-com:vml" xmlns:wp14="http://schemas.microsoft.com/office/word/2010/wordprocessingDrawing" xmlns:wp="http://schemas.openxmlformats.org/drawingml/2006/wordprocessingDrawing" xmlns:w10="urn:schemas-microsoft-com:office:word" xmlns:w="http://schemas.openxmlformats.org/wordprocessingml/2006/main" xmlns:w14="http://schemas.microsoft.com/office/word/2010/wordml" xmlns:wpg="http://schemas.microsoft.com/office/word/2010/wordprocessingGroup" xmlns:wpi="http://schemas.microsoft.com/office/word/2010/wordprocessingInk" xmlns:wne="http://schemas.microsoft.com/office/word/2006/wordml" xmlns:wps="http://schemas.microsoft.com/office/word/2010/wordprocessingShape" mc:Ignorable="w14 wp14">
   <w:body>
-    <w:p>
-      <w:pPr>
-        <w:jc w:val="center"/>
-      </w:pPr>
-      <w:r>
-        <w:rPr>
-          <w:b/>
-          <w:sz w:val="20"/>
-        </w:rPr>
-        <w:t>GOVERNO DO ESTADO DE RONDONIA</w:t>
-      </w:r>
-    </w:p>
-    <w:p>
-      <w:pPr>
-        <w:jc w:val="center"/>
-      </w:pPr>
-      <w:r>
-        <w:rPr>
-          <w:sz w:val="16"/>
-        </w:rPr>
-        <w:t>Agencia de Defesa Sanitaria Agrosilvopastoril do Estado de Rondonia - IDARON</w:t>
-      </w:r>
-    </w:p>
     <w:p>
       <w:pPr>
         <w:jc w:val="center"/>
@@ -100,7 +77,6 @@
                 <w:b/>
                 <w:sz w:val="22"/>
               </w:rPr>
-              <w:t>Mario aquele</w:t>
             </w:r>
           </w:p>
         </w:tc>
@@ -145,7 +121,6 @@
                 <w:b/>
                 <w:sz w:val="22"/>
               </w:rPr>
-              <w:t>bombeiro</w:t>
             </w:r>
           </w:p>
         </w:tc>
@@ -190,7 +165,6 @@
                 <w:b/>
                 <w:sz w:val="22"/>
               </w:rPr>
-              <w:t>nivel meidio</w:t>
             </w:r>
           </w:p>
         </w:tc>
@@ -235,7 +209,6 @@
                 <w:b/>
                 <w:sz w:val="22"/>
               </w:rPr>
-              <w:t>323232323</w:t>
             </w:r>
           </w:p>
         </w:tc>
@@ -279,7 +252,6 @@
                 <w:b/>
                 <w:sz w:val="22"/>
               </w:rPr>
-              <w:t>888885</w:t>
             </w:r>
           </w:p>
         </w:tc>
@@ -311,7 +283,6 @@
                 <w:b/>
                 <w:sz w:val="22"/>
               </w:rPr>
-              <w:t>76356566</w:t>
             </w:r>
           </w:p>
         </w:tc>
@@ -349,7 +320,6 @@
                 <w:b/>
                 <w:sz w:val="22"/>
               </w:rPr>
-              <w:t>sdfdfd</w:t>
             </w:r>
           </w:p>
         </w:tc>
@@ -381,7 +351,7 @@
                 <w:b/>
                 <w:sz w:val="22"/>
               </w:rPr>
-              <w:t>02/03/2026</w:t>
+              <w:t>11/03/2026</w:t>
             </w:r>
           </w:p>
         </w:tc>
@@ -419,7 +389,6 @@
                 <w:b/>
                 <w:sz w:val="22"/>
               </w:rPr>
-              <w:t>fdfdfasfdfa</w:t>
             </w:r>
           </w:p>
         </w:tc>
@@ -457,7 +426,6 @@
                 <w:b/>
                 <w:sz w:val="22"/>
               </w:rPr>
-              <w:t>fdffdfdf</w:t>
             </w:r>
           </w:p>
         </w:tc>
@@ -489,7 +457,7 @@
                 <w:b/>
                 <w:sz w:val="22"/>
               </w:rPr>
-              <w:t>02/03/2026</w:t>
+              <w:t>11/03/2026</w:t>
             </w:r>
           </w:p>
         </w:tc>
@@ -641,7 +609,7 @@
                 <w:b/>
                 <w:sz w:val="22"/>
               </w:rPr>
-              <w:t>Todos os documentos, exceto CIS-E, CTC, GTR, Auto de Infracao</w:t>
+              <w:t>Todos os documentos, exceto CIS-E, CTC, GTR, Auto de Infração</w:t>
             </w:r>
           </w:p>
         </w:tc>
@@ -788,13 +756,85 @@
       </w:tr>
     </w:tbl>
     <w:sectPr>
+      <w:headerReference w:type="default" r:id="rId9"/>
       <w:pgSz w:w="11906" w:h="16838"/>
-      <w:pgMar w:top="850" w:right="1134" w:bottom="850" w:left="1134" w:header="720" w:footer="720" w:gutter="0"/>
+      <w:pgMar w:top="2041" w:right="1134" w:bottom="850" w:left="1134" w:header="340" w:footer="720" w:gutter="0"/>
       <w:cols w:space="720"/>
       <w:docGrid w:linePitch="360"/>
     </w:sectPr>
   </w:body>
 </w:document>
+</file>
+
+<file path=word/header1.xml><?xml version="1.0" encoding="utf-8"?>
+<w:hdr xmlns:m="http://schemas.openxmlformats.org/officeDocument/2006/math" xmlns:mc="http://schemas.openxmlformats.org/markup-compatibility/2006" xmlns:mo="http://schemas.microsoft.com/office/mac/office/2008/main" xmlns:mv="urn:schemas-microsoft-com:mac:vml" xmlns:o="urn:schemas-microsoft-com:office:office" xmlns:r="http://schemas.openxmlformats.org/officeDocument/2006/relationships" xmlns:v="urn:schemas-microsoft-com:vml" xmlns:w10="urn:schemas-microsoft-com:office:word" xmlns:w14="http://schemas.microsoft.com/office/word/2010/wordml" xmlns:w="http://schemas.openxmlformats.org/wordprocessingml/2006/main" xmlns:wne="http://schemas.microsoft.com/office/word/2006/wordml" xmlns:wp14="http://schemas.microsoft.com/office/word/2010/wordprocessingDrawing" xmlns:wp="http://schemas.openxmlformats.org/drawingml/2006/wordprocessingDrawing" xmlns:wpc="http://schemas.microsoft.com/office/word/2010/wordprocessingCanvas" xmlns:wpg="http://schemas.microsoft.com/office/word/2010/wordprocessingGroup" xmlns:wpi="http://schemas.microsoft.com/office/word/2010/wordprocessingInk" xmlns:wps="http://schemas.microsoft.com/office/word/2010/wordprocessingShape" mc:Ignorable="w14 wp14">
+  <w:p>
+    <w:pPr>
+      <w:pStyle w:val="Header"/>
+      <w:spacing w:before="0" w:after="40"/>
+      <w:jc w:val="center"/>
+    </w:pPr>
+    <w:r>
+      <w:drawing>
+        <wp:inline xmlns:a="http://schemas.openxmlformats.org/drawingml/2006/main" xmlns:pic="http://schemas.openxmlformats.org/drawingml/2006/picture">
+          <wp:extent cx="864000" cy="864000"/>
+          <wp:docPr id="1" name="Picture 1"/>
+          <wp:cNvGraphicFramePr>
+            <a:graphicFrameLocks noChangeAspect="1"/>
+          </wp:cNvGraphicFramePr>
+          <a:graphic>
+            <a:graphicData uri="http://schemas.openxmlformats.org/drawingml/2006/picture">
+              <pic:pic>
+                <pic:nvPicPr>
+                  <pic:cNvPr id="0" name="logo_ro_horizontal.JPG"/>
+                  <pic:cNvPicPr/>
+                </pic:nvPicPr>
+                <pic:blipFill>
+                  <a:blip r:embed="rId1"/>
+                  <a:stretch>
+                    <a:fillRect/>
+                  </a:stretch>
+                </pic:blipFill>
+                <pic:spPr>
+                  <a:xfrm>
+                    <a:off x="0" y="0"/>
+                    <a:ext cx="864000" cy="864000"/>
+                  </a:xfrm>
+                  <a:prstGeom prst="rect"/>
+                </pic:spPr>
+              </pic:pic>
+            </a:graphicData>
+          </a:graphic>
+        </wp:inline>
+      </w:drawing>
+    </w:r>
+  </w:p>
+  <w:p>
+    <w:pPr>
+      <w:spacing w:before="0" w:after="0"/>
+      <w:jc w:val="center"/>
+    </w:pPr>
+    <w:r>
+      <w:rPr>
+        <w:b/>
+        <w:sz w:val="17"/>
+      </w:rPr>
+      <w:t>GOVERNO DO ESTADO DE RONDONIA</w:t>
+    </w:r>
+  </w:p>
+  <w:p>
+    <w:pPr>
+      <w:spacing w:before="0" w:after="0"/>
+      <w:jc w:val="center"/>
+    </w:pPr>
+    <w:r>
+      <w:rPr>
+        <w:sz w:val="14"/>
+      </w:rPr>
+      <w:t>Agencia de Defesa Sanitaria Agrosilvopastoril do Estado de Rondonia - IDARON</w:t>
+    </w:r>
+  </w:p>
+</w:hdr>
 </file>
 
 <file path=word/numbering.xml><?xml version="1.0" encoding="utf-8"?>

</xml_diff>

<commit_message>
acrecentando declaração se suinos
</commit_message>
<xml_diff>
--- a/pdf/cadastro_emissao_gta.docx
+++ b/pdf/cadastro_emissao_gta.docx
@@ -11,7 +11,7 @@
           <w:b/>
           <w:sz w:val="24"/>
         </w:rPr>
-        <w:t>CADASTRO DE SERVIDOR PARA EMISSAO DE GTA</w:t>
+        <w:t>CADASTRO DE SERVIDOR PARA EMISSÃO DE GTA</w:t>
       </w:r>
     </w:p>
     <w:tbl>
@@ -77,6 +77,7 @@
                 <w:b/>
                 <w:sz w:val="22"/>
               </w:rPr>
+              <w:t>Rudi de Ros</w:t>
             </w:r>
           </w:p>
         </w:tc>
@@ -152,7 +153,7 @@
               <w:rPr>
                 <w:sz w:val="14"/>
               </w:rPr>
-              <w:t>FORMACAO:</w:t>
+              <w:t>FORMAÇÃO:</w:t>
             </w:r>
           </w:p>
           <w:p>
@@ -196,7 +197,7 @@
               <w:rPr>
                 <w:sz w:val="14"/>
               </w:rPr>
-              <w:t>MATRICULA:</w:t>
+              <w:t>MATRÍCULA:</w:t>
             </w:r>
           </w:p>
           <w:p>
@@ -307,7 +308,7 @@
               <w:rPr>
                 <w:sz w:val="14"/>
               </w:rPr>
-              <w:t>ORGAO DE ORIGEM:</w:t>
+              <w:t>ÓRGÃO DE ORIGEM:</w:t>
             </w:r>
           </w:p>
           <w:p>
@@ -338,7 +339,7 @@
               <w:rPr>
                 <w:sz w:val="14"/>
               </w:rPr>
-              <w:t>DATA DA EMISSAO:</w:t>
+              <w:t>DATA DA EMISSÃO:</w:t>
             </w:r>
           </w:p>
           <w:p>
@@ -351,7 +352,7 @@
                 <w:b/>
                 <w:sz w:val="22"/>
               </w:rPr>
-              <w:t>11/03/2026</w:t>
+              <w:t>25/03/2026</w:t>
             </w:r>
           </w:p>
         </w:tc>
@@ -413,7 +414,7 @@
               <w:rPr>
                 <w:sz w:val="14"/>
               </w:rPr>
-              <w:t>UNIDADE DE LOTACAO:</w:t>
+              <w:t>UNIDADE DE LOTAÇÃO:</w:t>
             </w:r>
           </w:p>
           <w:p>
@@ -444,7 +445,7 @@
               <w:rPr>
                 <w:sz w:val="14"/>
               </w:rPr>
-              <w:t>DATA DE LOTACAO:</w:t>
+              <w:t>DATA DE LOTAÇÃO:</w:t>
             </w:r>
           </w:p>
           <w:p>
@@ -457,7 +458,7 @@
                 <w:b/>
                 <w:sz w:val="22"/>
               </w:rPr>
-              <w:t>11/03/2026</w:t>
+              <w:t>25/03/2026</w:t>
             </w:r>
           </w:p>
         </w:tc>
@@ -482,7 +483,7 @@
               <w:rPr>
                 <w:sz w:val="14"/>
               </w:rPr>
-              <w:t>AUTORIZADO PARA TRANSITO:</w:t>
+              <w:t>AUTORIZADO PARA TRÂNSITO:</w:t>
             </w:r>
           </w:p>
           <w:p>
@@ -558,7 +559,7 @@
               <w:rPr>
                 <w:sz w:val="14"/>
               </w:rPr>
-              <w:t>ESPECIES AUTORIZADAS:</w:t>
+              <w:t>ESPÉCIES AUTORIZADAS:</w:t>
             </w:r>
           </w:p>
           <w:p>
@@ -819,7 +820,7 @@
         <w:b/>
         <w:sz w:val="17"/>
       </w:rPr>
-      <w:t>GOVERNO DO ESTADO DE RONDONIA</w:t>
+      <w:t>GOVERNO DO ESTADO DE RONDÔNIA</w:t>
     </w:r>
   </w:p>
   <w:p>
@@ -831,7 +832,7 @@
       <w:rPr>
         <w:sz w:val="14"/>
       </w:rPr>
-      <w:t>Agencia de Defesa Sanitaria Agrosilvopastoril do Estado de Rondonia - IDARON</w:t>
+      <w:t>Agência de Defesa Sanitária Agrosilvopastoril do Estado de Rondônia - IDARON</w:t>
     </w:r>
   </w:p>
 </w:hdr>

</xml_diff>